<commit_message>
Cahier de charge pour le groupe ae
</commit_message>
<xml_diff>
--- a/groupe2-ae/Répartition des tâches.docx
+++ b/groupe2-ae/Répartition des tâches.docx
@@ -193,89 +193,689 @@
           <w:szCs w:val="32"/>
         </w:rPr>
       </w:pPr>
+    </w:p>
+    <w:p>
+      <w:pPr>
+        <w:rPr>
+          <w:rFonts w:ascii="Bell MT" w:hAnsi="Bell MT"/>
+          <w:color w:val="FF0000"/>
+        </w:rPr>
+      </w:pPr>
+      <w:r>
+        <w:rPr>
+          <w:rFonts w:ascii="Bell MT" w:hAnsi="Bell MT"/>
+        </w:rPr>
+        <w:t xml:space="preserve">NB : </w:t>
+      </w:r>
+      <w:r>
+        <w:rPr>
+          <w:rFonts w:ascii="Bell MT" w:hAnsi="Bell MT"/>
+          <w:color w:val="FF0000"/>
+        </w:rPr>
+        <w:t xml:space="preserve">Toutes les équipes chargées des Applications ne doivent pas encore relier à la base de données. Juste faire les Applications rien d’autres. </w:t>
+      </w:r>
+      <w:r>
+        <w:rPr>
+          <w:rFonts w:ascii="Bell MT" w:hAnsi="Bell MT"/>
+          <w:color w:val="FF0000"/>
+        </w:rPr>
+        <w:br/>
+        <w:t xml:space="preserve">Apprenez à utiliser </w:t>
+      </w:r>
+      <w:proofErr w:type="spellStart"/>
+      <w:r>
+        <w:rPr>
+          <w:rFonts w:ascii="Bell MT" w:hAnsi="Bell MT"/>
+          <w:color w:val="FF0000"/>
+        </w:rPr>
+        <w:t>GitHub</w:t>
+      </w:r>
+      <w:proofErr w:type="spellEnd"/>
+      <w:r>
+        <w:rPr>
+          <w:rFonts w:ascii="Bell MT" w:hAnsi="Bell MT"/>
+          <w:color w:val="FF0000"/>
+        </w:rPr>
+        <w:t xml:space="preserve"> dernier délai Mardi 15h. On veut voir tout le monde sur </w:t>
+      </w:r>
+      <w:proofErr w:type="spellStart"/>
+      <w:r>
+        <w:rPr>
+          <w:rFonts w:ascii="Bell MT" w:hAnsi="Bell MT"/>
+          <w:color w:val="FF0000"/>
+        </w:rPr>
+        <w:t>GitHub</w:t>
+      </w:r>
+      <w:proofErr w:type="spellEnd"/>
+      <w:r>
+        <w:rPr>
+          <w:rFonts w:ascii="Bell MT" w:hAnsi="Bell MT"/>
+          <w:color w:val="FF0000"/>
+        </w:rPr>
+        <w:t xml:space="preserve"> ce </w:t>
+      </w:r>
+      <w:proofErr w:type="spellStart"/>
+      <w:r>
+        <w:rPr>
+          <w:rFonts w:ascii="Bell MT" w:hAnsi="Bell MT"/>
+          <w:color w:val="FF0000"/>
+        </w:rPr>
+        <w:t>jour là</w:t>
+      </w:r>
+      <w:proofErr w:type="spellEnd"/>
+      <w:r>
+        <w:rPr>
+          <w:rFonts w:ascii="Bell MT" w:hAnsi="Bell MT"/>
+          <w:color w:val="FF0000"/>
+        </w:rPr>
+        <w:t>.</w:t>
+      </w:r>
+    </w:p>
+    <w:p>
+      <w:pPr>
+        <w:rPr>
+          <w:rFonts w:ascii="Bell MT" w:hAnsi="Bell MT"/>
+        </w:rPr>
+      </w:pPr>
+      <w:r>
+        <w:rPr>
+          <w:rFonts w:ascii="Bell MT" w:hAnsi="Bell MT"/>
+        </w:rPr>
+        <w:t xml:space="preserve">Chaque groupe de travail doit d’abord prendre en compte les demandes du cahier de charge et puis après seulement commencer à les lister puis voir comment les réaliser. Lire -&gt; Noter -&gt; Réaliser pardon. </w:t>
+      </w:r>
+    </w:p>
+    <w:p/>
+    <w:p>
+      <w:pPr>
+        <w:spacing w:before="100" w:beforeAutospacing="1" w:after="100" w:afterAutospacing="1" w:line="240" w:lineRule="auto"/>
+        <w:outlineLvl w:val="2"/>
+        <w:rPr>
+          <w:rFonts w:ascii="Times New Roman" w:eastAsia="Times New Roman" w:hAnsi="Times New Roman" w:cs="Times New Roman"/>
+          <w:b/>
+          <w:bCs/>
+          <w:sz w:val="27"/>
+          <w:szCs w:val="27"/>
+          <w:lang w:eastAsia="fr-FR"/>
+        </w:rPr>
+      </w:pPr>
+      <w:r>
+        <w:rPr>
+          <w:rFonts w:ascii="Times New Roman" w:eastAsia="Times New Roman" w:hAnsi="Times New Roman" w:cs="Times New Roman"/>
+          <w:b/>
+          <w:bCs/>
+          <w:sz w:val="27"/>
+          <w:szCs w:val="27"/>
+          <w:lang w:eastAsia="fr-FR"/>
+        </w:rPr>
+        <w:t>Liste des exigences du cahier de charges pour l'AE</w:t>
+      </w:r>
+    </w:p>
+    <w:p>
+      <w:pPr>
+        <w:numPr>
+          <w:ilvl w:val="0"/>
+          <w:numId w:val="1"/>
+        </w:numPr>
+        <w:spacing w:before="100" w:beforeAutospacing="1" w:after="100" w:afterAutospacing="1" w:line="240" w:lineRule="auto"/>
+        <w:rPr>
+          <w:rFonts w:ascii="Bell MT" w:eastAsia="Times New Roman" w:hAnsi="Bell MT" w:cs="Times New Roman"/>
+          <w:sz w:val="24"/>
+          <w:szCs w:val="24"/>
+          <w:lang w:eastAsia="fr-FR"/>
+        </w:rPr>
+      </w:pPr>
+      <w:r>
+        <w:rPr>
+          <w:rFonts w:ascii="Bell MT" w:eastAsia="Times New Roman" w:hAnsi="Bell MT" w:cs="Times New Roman"/>
+          <w:bCs/>
+          <w:sz w:val="24"/>
+          <w:szCs w:val="24"/>
+          <w:lang w:eastAsia="fr-FR"/>
+        </w:rPr>
+        <w:t>Développer une interface graphique complète :</w:t>
+      </w:r>
+      <w:r>
+        <w:rPr>
+          <w:rFonts w:ascii="Bell MT" w:eastAsia="Times New Roman" w:hAnsi="Bell MT" w:cs="Times New Roman"/>
+          <w:sz w:val="24"/>
+          <w:szCs w:val="24"/>
+          <w:lang w:eastAsia="fr-FR"/>
+        </w:rPr>
+        <w:t xml:space="preserve"> L'AE doit impérativement être dotée d'une Interface Personne-Machine Graphique (IPMG) intuitive et propre.</w:t>
+      </w:r>
+    </w:p>
+    <w:p>
+      <w:pPr>
+        <w:numPr>
+          <w:ilvl w:val="0"/>
+          <w:numId w:val="1"/>
+        </w:numPr>
+        <w:spacing w:before="100" w:beforeAutospacing="1" w:after="100" w:afterAutospacing="1" w:line="240" w:lineRule="auto"/>
+        <w:rPr>
+          <w:rFonts w:ascii="Bell MT" w:eastAsia="Times New Roman" w:hAnsi="Bell MT" w:cs="Times New Roman"/>
+          <w:sz w:val="24"/>
+          <w:szCs w:val="24"/>
+          <w:lang w:eastAsia="fr-FR"/>
+        </w:rPr>
+      </w:pPr>
+      <w:r>
+        <w:rPr>
+          <w:rFonts w:ascii="Bell MT" w:eastAsia="Times New Roman" w:hAnsi="Bell MT" w:cs="Times New Roman"/>
+          <w:bCs/>
+          <w:sz w:val="24"/>
+          <w:szCs w:val="24"/>
+          <w:lang w:eastAsia="fr-FR"/>
+        </w:rPr>
+        <w:t>Fournir le Document de Spécification des Exigences du Logiciel (SEL) :</w:t>
+      </w:r>
+      <w:r>
+        <w:rPr>
+          <w:rFonts w:ascii="Bell MT" w:eastAsia="Times New Roman" w:hAnsi="Bell MT" w:cs="Times New Roman"/>
+          <w:sz w:val="24"/>
+          <w:szCs w:val="24"/>
+          <w:lang w:eastAsia="fr-FR"/>
+        </w:rPr>
+        <w:t xml:space="preserve"> Rédiger ce document qui contient l'analyse, l'expression des besoins et la table des matières de  l’application.</w:t>
+      </w:r>
+    </w:p>
+    <w:p>
+      <w:pPr>
+        <w:numPr>
+          <w:ilvl w:val="0"/>
+          <w:numId w:val="1"/>
+        </w:numPr>
+        <w:spacing w:before="100" w:beforeAutospacing="1" w:after="100" w:afterAutospacing="1" w:line="240" w:lineRule="auto"/>
+        <w:rPr>
+          <w:rFonts w:ascii="Bell MT" w:eastAsia="Times New Roman" w:hAnsi="Bell MT" w:cs="Times New Roman"/>
+          <w:sz w:val="24"/>
+          <w:szCs w:val="24"/>
+          <w:lang w:eastAsia="fr-FR"/>
+        </w:rPr>
+      </w:pPr>
+      <w:r>
+        <w:rPr>
+          <w:rFonts w:ascii="Bell MT" w:eastAsia="Times New Roman" w:hAnsi="Bell MT" w:cs="Times New Roman"/>
+          <w:bCs/>
+          <w:sz w:val="24"/>
+          <w:szCs w:val="24"/>
+          <w:lang w:eastAsia="fr-FR"/>
+        </w:rPr>
+        <w:t>Fournir le Document de Spécification de Conception du Logiciel (SCL) :</w:t>
+      </w:r>
+      <w:r>
+        <w:rPr>
+          <w:rFonts w:ascii="Bell MT" w:eastAsia="Times New Roman" w:hAnsi="Bell MT" w:cs="Times New Roman"/>
+          <w:sz w:val="24"/>
+          <w:szCs w:val="24"/>
+          <w:lang w:eastAsia="fr-FR"/>
+        </w:rPr>
+        <w:t xml:space="preserve"> Documenter l'architecture du code.</w:t>
+      </w:r>
+    </w:p>
+    <w:p>
+      <w:pPr>
+        <w:numPr>
+          <w:ilvl w:val="0"/>
+          <w:numId w:val="1"/>
+        </w:numPr>
+        <w:spacing w:before="100" w:beforeAutospacing="1" w:after="100" w:afterAutospacing="1" w:line="240" w:lineRule="auto"/>
+        <w:rPr>
+          <w:rFonts w:ascii="Bell MT" w:eastAsia="Times New Roman" w:hAnsi="Bell MT" w:cs="Times New Roman"/>
+          <w:sz w:val="24"/>
+          <w:szCs w:val="24"/>
+          <w:lang w:eastAsia="fr-FR"/>
+        </w:rPr>
+      </w:pPr>
+      <w:r>
+        <w:rPr>
+          <w:rFonts w:ascii="Bell MT" w:eastAsia="Times New Roman" w:hAnsi="Bell MT" w:cs="Times New Roman"/>
+          <w:bCs/>
+          <w:sz w:val="24"/>
+          <w:szCs w:val="24"/>
+          <w:lang w:eastAsia="fr-FR"/>
+        </w:rPr>
+        <w:t>Réaliser la modélisation UML complète :</w:t>
+      </w:r>
+      <w:r>
+        <w:rPr>
+          <w:rFonts w:ascii="Bell MT" w:eastAsia="Times New Roman" w:hAnsi="Bell MT" w:cs="Times New Roman"/>
+          <w:sz w:val="24"/>
+          <w:szCs w:val="24"/>
+          <w:lang w:eastAsia="fr-FR"/>
+        </w:rPr>
+        <w:t xml:space="preserve"> Intégrer un Diagramme de contexte (ou flux de données), un Diagramme de cas d'utilisation UML, et un Diagramme d'interaction/flux pour le cheminement des écrans.</w:t>
+      </w:r>
+      <w:r>
+        <w:rPr>
+          <w:rFonts w:ascii="Bell MT" w:eastAsia="Times New Roman" w:hAnsi="Bell MT" w:cs="Times New Roman"/>
+          <w:sz w:val="24"/>
+          <w:szCs w:val="24"/>
+          <w:lang w:eastAsia="fr-FR"/>
+        </w:rPr>
+        <w:t xml:space="preserve"> (Pas besoin d’un diagramme de classe)</w:t>
+      </w:r>
+    </w:p>
+    <w:p>
+      <w:pPr>
+        <w:numPr>
+          <w:ilvl w:val="0"/>
+          <w:numId w:val="1"/>
+        </w:numPr>
+        <w:spacing w:before="100" w:beforeAutospacing="1" w:after="100" w:afterAutospacing="1" w:line="240" w:lineRule="auto"/>
+        <w:rPr>
+          <w:rFonts w:ascii="Bell MT" w:eastAsia="Times New Roman" w:hAnsi="Bell MT" w:cs="Times New Roman"/>
+          <w:sz w:val="24"/>
+          <w:szCs w:val="24"/>
+          <w:lang w:eastAsia="fr-FR"/>
+        </w:rPr>
+      </w:pPr>
+      <w:r>
+        <w:rPr>
+          <w:rFonts w:ascii="Bell MT" w:eastAsia="Times New Roman" w:hAnsi="Bell MT" w:cs="Times New Roman"/>
+          <w:bCs/>
+          <w:sz w:val="24"/>
+          <w:szCs w:val="24"/>
+          <w:lang w:eastAsia="fr-FR"/>
+        </w:rPr>
+        <w:t>Permettre la consultation des stocks en temps réel :</w:t>
+      </w:r>
+      <w:r>
+        <w:rPr>
+          <w:rFonts w:ascii="Bell MT" w:eastAsia="Times New Roman" w:hAnsi="Bell MT" w:cs="Times New Roman"/>
+          <w:sz w:val="24"/>
+          <w:szCs w:val="24"/>
+          <w:lang w:eastAsia="fr-FR"/>
+        </w:rPr>
+        <w:t xml:space="preserve"> L'interface doit afficher l'état actuel des produits, des lots et des inventaires dans l'entrepôt.</w:t>
+      </w:r>
       <w:bookmarkStart w:id="0" w:name="_GoBack"/>
       <w:bookmarkEnd w:id="0"/>
     </w:p>
     <w:p>
       <w:pPr>
-        <w:rPr>
-          <w:color w:val="FF0000"/>
-        </w:rPr>
-      </w:pPr>
-      <w:r>
-        <w:t xml:space="preserve">NB : </w:t>
-      </w:r>
-      <w:r>
-        <w:rPr>
-          <w:color w:val="FF0000"/>
-        </w:rPr>
-        <w:t xml:space="preserve">Toutes les équipes chargées des Applications ne doivent pas encore relier à la base de données. Juste faire les Applications rien d’autres. </w:t>
-      </w:r>
-      <w:r>
-        <w:rPr>
-          <w:color w:val="FF0000"/>
-        </w:rPr>
-        <w:br/>
-        <w:t xml:space="preserve">Apprenez à utiliser </w:t>
+        <w:numPr>
+          <w:ilvl w:val="0"/>
+          <w:numId w:val="1"/>
+        </w:numPr>
+        <w:spacing w:before="100" w:beforeAutospacing="1" w:after="100" w:afterAutospacing="1" w:line="240" w:lineRule="auto"/>
+        <w:rPr>
+          <w:rFonts w:ascii="Bell MT" w:eastAsia="Times New Roman" w:hAnsi="Bell MT" w:cs="Times New Roman"/>
+          <w:sz w:val="24"/>
+          <w:szCs w:val="24"/>
+          <w:lang w:eastAsia="fr-FR"/>
+        </w:rPr>
+      </w:pPr>
+      <w:r>
+        <w:rPr>
+          <w:rFonts w:ascii="Bell MT" w:eastAsia="Times New Roman" w:hAnsi="Bell MT" w:cs="Times New Roman"/>
+          <w:bCs/>
+          <w:sz w:val="24"/>
+          <w:szCs w:val="24"/>
+          <w:lang w:eastAsia="fr-FR"/>
+        </w:rPr>
+        <w:t>Permettre la mise à jour des stocks :</w:t>
+      </w:r>
+      <w:r>
+        <w:rPr>
+          <w:rFonts w:ascii="Bell MT" w:eastAsia="Times New Roman" w:hAnsi="Bell MT" w:cs="Times New Roman"/>
+          <w:sz w:val="24"/>
+          <w:szCs w:val="24"/>
+          <w:lang w:eastAsia="fr-FR"/>
+        </w:rPr>
+        <w:t xml:space="preserve"> L'utilisateur doit pouvoir modifier les quantités, déplacer des produits ou changer les statuts directement depuis l'interface.</w:t>
+      </w:r>
+    </w:p>
+    <w:p>
+      <w:pPr>
+        <w:numPr>
+          <w:ilvl w:val="0"/>
+          <w:numId w:val="1"/>
+        </w:numPr>
+        <w:spacing w:before="100" w:beforeAutospacing="1" w:after="100" w:afterAutospacing="1" w:line="240" w:lineRule="auto"/>
+        <w:rPr>
+          <w:rFonts w:ascii="Bell MT" w:eastAsia="Times New Roman" w:hAnsi="Bell MT" w:cs="Times New Roman"/>
+          <w:sz w:val="24"/>
+          <w:szCs w:val="24"/>
+          <w:lang w:eastAsia="fr-FR"/>
+        </w:rPr>
+      </w:pPr>
+      <w:r>
+        <w:rPr>
+          <w:rFonts w:ascii="Bell MT" w:eastAsia="Times New Roman" w:hAnsi="Bell MT" w:cs="Times New Roman"/>
+          <w:bCs/>
+          <w:sz w:val="24"/>
+          <w:szCs w:val="24"/>
+          <w:lang w:eastAsia="fr-FR"/>
+        </w:rPr>
+        <w:t>Gérer les mouvements d'Entrées (Réception) :</w:t>
+      </w:r>
+      <w:r>
+        <w:rPr>
+          <w:rFonts w:ascii="Bell MT" w:eastAsia="Times New Roman" w:hAnsi="Bell MT" w:cs="Times New Roman"/>
+          <w:sz w:val="24"/>
+          <w:szCs w:val="24"/>
+          <w:lang w:eastAsia="fr-FR"/>
+        </w:rPr>
+        <w:t xml:space="preserve"> Créer les écrans pour la réception des colis, le déchargement, la vérification et l'affectation aux cellules de stockage.</w:t>
+      </w:r>
+    </w:p>
+    <w:p>
+      <w:pPr>
+        <w:numPr>
+          <w:ilvl w:val="0"/>
+          <w:numId w:val="1"/>
+        </w:numPr>
+        <w:spacing w:before="100" w:beforeAutospacing="1" w:after="100" w:afterAutospacing="1" w:line="240" w:lineRule="auto"/>
+        <w:rPr>
+          <w:rFonts w:ascii="Bell MT" w:eastAsia="Times New Roman" w:hAnsi="Bell MT" w:cs="Times New Roman"/>
+          <w:sz w:val="24"/>
+          <w:szCs w:val="24"/>
+          <w:lang w:eastAsia="fr-FR"/>
+        </w:rPr>
+      </w:pPr>
+      <w:r>
+        <w:rPr>
+          <w:rFonts w:ascii="Bell MT" w:eastAsia="Times New Roman" w:hAnsi="Bell MT" w:cs="Times New Roman"/>
+          <w:bCs/>
+          <w:sz w:val="24"/>
+          <w:szCs w:val="24"/>
+          <w:lang w:eastAsia="fr-FR"/>
+        </w:rPr>
+        <w:t>Gérer les mouvements de Sorties (Expédition) :</w:t>
+      </w:r>
+      <w:r>
+        <w:rPr>
+          <w:rFonts w:ascii="Bell MT" w:eastAsia="Times New Roman" w:hAnsi="Bell MT" w:cs="Times New Roman"/>
+          <w:sz w:val="24"/>
+          <w:szCs w:val="24"/>
+          <w:lang w:eastAsia="fr-FR"/>
+        </w:rPr>
+        <w:t xml:space="preserve"> Créer les écrans pour la préparation des commandes, le colisage et le chargement dans les camions.</w:t>
+      </w:r>
+    </w:p>
+    <w:p>
+      <w:pPr>
+        <w:numPr>
+          <w:ilvl w:val="0"/>
+          <w:numId w:val="1"/>
+        </w:numPr>
+        <w:spacing w:before="100" w:beforeAutospacing="1" w:after="100" w:afterAutospacing="1" w:line="240" w:lineRule="auto"/>
+        <w:rPr>
+          <w:rFonts w:ascii="Bell MT" w:eastAsia="Times New Roman" w:hAnsi="Bell MT" w:cs="Times New Roman"/>
+          <w:sz w:val="24"/>
+          <w:szCs w:val="24"/>
+          <w:lang w:eastAsia="fr-FR"/>
+        </w:rPr>
+      </w:pPr>
+      <w:r>
+        <w:rPr>
+          <w:rFonts w:ascii="Bell MT" w:eastAsia="Times New Roman" w:hAnsi="Bell MT" w:cs="Times New Roman"/>
+          <w:bCs/>
+          <w:sz w:val="24"/>
+          <w:szCs w:val="24"/>
+          <w:lang w:eastAsia="fr-FR"/>
+        </w:rPr>
+        <w:t>Gérer la persistance des données :</w:t>
+      </w:r>
+      <w:r>
+        <w:rPr>
+          <w:rFonts w:ascii="Bell MT" w:eastAsia="Times New Roman" w:hAnsi="Bell MT" w:cs="Times New Roman"/>
+          <w:sz w:val="24"/>
+          <w:szCs w:val="24"/>
+          <w:lang w:eastAsia="fr-FR"/>
+        </w:rPr>
+        <w:t xml:space="preserve"> Le code Java doit obligatoirement se connecter à la base de données </w:t>
       </w:r>
       <w:proofErr w:type="spellStart"/>
       <w:r>
         <w:rPr>
-          <w:color w:val="FF0000"/>
-        </w:rPr>
-        <w:t>GitHub</w:t>
+          <w:rFonts w:ascii="Bell MT" w:eastAsia="Times New Roman" w:hAnsi="Bell MT" w:cs="Times New Roman"/>
+          <w:sz w:val="24"/>
+          <w:szCs w:val="24"/>
+          <w:lang w:eastAsia="fr-FR"/>
+        </w:rPr>
+        <w:t>PostgreSQL</w:t>
       </w:r>
       <w:proofErr w:type="spellEnd"/>
       <w:r>
         <w:rPr>
-          <w:color w:val="FF0000"/>
-        </w:rPr>
-        <w:t xml:space="preserve"> dernier délai Mardi 15h. On veut voir tout le monde sur </w:t>
+          <w:rFonts w:ascii="Bell MT" w:eastAsia="Times New Roman" w:hAnsi="Bell MT" w:cs="Times New Roman"/>
+          <w:sz w:val="24"/>
+          <w:szCs w:val="24"/>
+          <w:lang w:eastAsia="fr-FR"/>
+        </w:rPr>
+        <w:t xml:space="preserve"> du Groupe 1 (via JDBC) pour lire et enregistrer les informations.</w:t>
+      </w:r>
+    </w:p>
+    <w:p>
+      <w:pPr>
+        <w:numPr>
+          <w:ilvl w:val="0"/>
+          <w:numId w:val="1"/>
+        </w:numPr>
+        <w:spacing w:before="100" w:beforeAutospacing="1" w:after="100" w:afterAutospacing="1" w:line="240" w:lineRule="auto"/>
+        <w:rPr>
+          <w:rFonts w:ascii="Bell MT" w:eastAsia="Times New Roman" w:hAnsi="Bell MT" w:cs="Times New Roman"/>
+          <w:sz w:val="24"/>
+          <w:szCs w:val="24"/>
+          <w:lang w:eastAsia="fr-FR"/>
+        </w:rPr>
+      </w:pPr>
+      <w:r>
+        <w:rPr>
+          <w:rFonts w:ascii="Bell MT" w:eastAsia="Times New Roman" w:hAnsi="Bell MT" w:cs="Times New Roman"/>
+          <w:bCs/>
+          <w:sz w:val="24"/>
+          <w:szCs w:val="24"/>
+          <w:lang w:eastAsia="fr-FR"/>
+        </w:rPr>
+        <w:t>Structurer le code en paquets (Packages) :</w:t>
+      </w:r>
+      <w:r>
+        <w:rPr>
+          <w:rFonts w:ascii="Bell MT" w:eastAsia="Times New Roman" w:hAnsi="Bell MT" w:cs="Times New Roman"/>
+          <w:sz w:val="24"/>
+          <w:szCs w:val="24"/>
+          <w:lang w:eastAsia="fr-FR"/>
+        </w:rPr>
+        <w:t xml:space="preserve"> Découper le projet Java proprement (par exemple : un package pour l'IHM, un pour les objets métiers, un pour la connexion BD).</w:t>
+      </w:r>
+    </w:p>
+    <w:p>
+      <w:pPr>
+        <w:numPr>
+          <w:ilvl w:val="0"/>
+          <w:numId w:val="1"/>
+        </w:numPr>
+        <w:spacing w:before="100" w:beforeAutospacing="1" w:after="100" w:afterAutospacing="1" w:line="240" w:lineRule="auto"/>
+        <w:rPr>
+          <w:rFonts w:ascii="Bell MT" w:eastAsia="Times New Roman" w:hAnsi="Bell MT" w:cs="Times New Roman"/>
+          <w:sz w:val="24"/>
+          <w:szCs w:val="24"/>
+          <w:lang w:eastAsia="fr-FR"/>
+        </w:rPr>
+      </w:pPr>
+      <w:r>
+        <w:rPr>
+          <w:rFonts w:ascii="Bell MT" w:eastAsia="Times New Roman" w:hAnsi="Bell MT" w:cs="Times New Roman"/>
+          <w:bCs/>
+          <w:sz w:val="24"/>
+          <w:szCs w:val="24"/>
+          <w:lang w:eastAsia="fr-FR"/>
+        </w:rPr>
+        <w:lastRenderedPageBreak/>
+        <w:t>Dresser l'inventaire des modules et bibliothèques :</w:t>
+      </w:r>
+      <w:r>
+        <w:rPr>
+          <w:rFonts w:ascii="Bell MT" w:eastAsia="Times New Roman" w:hAnsi="Bell MT" w:cs="Times New Roman"/>
+          <w:sz w:val="24"/>
+          <w:szCs w:val="24"/>
+          <w:lang w:eastAsia="fr-FR"/>
+        </w:rPr>
+        <w:t xml:space="preserve"> Lister toutes les librairies externes utilisées (ex: le driver JDBC de </w:t>
       </w:r>
       <w:proofErr w:type="spellStart"/>
       <w:r>
         <w:rPr>
-          <w:color w:val="FF0000"/>
-        </w:rPr>
-        <w:t>GitHub</w:t>
+          <w:rFonts w:ascii="Bell MT" w:eastAsia="Times New Roman" w:hAnsi="Bell MT" w:cs="Times New Roman"/>
+          <w:sz w:val="24"/>
+          <w:szCs w:val="24"/>
+          <w:lang w:eastAsia="fr-FR"/>
+        </w:rPr>
+        <w:t>Postgres</w:t>
       </w:r>
       <w:proofErr w:type="spellEnd"/>
       <w:r>
         <w:rPr>
-          <w:color w:val="FF0000"/>
-        </w:rPr>
-        <w:t xml:space="preserve"> ce </w:t>
+          <w:rFonts w:ascii="Bell MT" w:eastAsia="Times New Roman" w:hAnsi="Bell MT" w:cs="Times New Roman"/>
+          <w:sz w:val="24"/>
+          <w:szCs w:val="24"/>
+          <w:lang w:eastAsia="fr-FR"/>
+        </w:rPr>
+        <w:t xml:space="preserve"> qui permet la connexion) et préciser obligatoirement leurs </w:t>
+      </w:r>
+      <w:r>
+        <w:rPr>
+          <w:rFonts w:ascii="Bell MT" w:eastAsia="Times New Roman" w:hAnsi="Bell MT" w:cs="Times New Roman"/>
+          <w:bCs/>
+          <w:sz w:val="24"/>
+          <w:szCs w:val="24"/>
+          <w:lang w:eastAsia="fr-FR"/>
+        </w:rPr>
+        <w:t>licences logicielles</w:t>
+      </w:r>
+      <w:r>
+        <w:rPr>
+          <w:rFonts w:ascii="Bell MT" w:eastAsia="Times New Roman" w:hAnsi="Bell MT" w:cs="Times New Roman"/>
+          <w:sz w:val="24"/>
+          <w:szCs w:val="24"/>
+          <w:lang w:eastAsia="fr-FR"/>
+        </w:rPr>
+        <w:t>.</w:t>
+      </w:r>
+    </w:p>
+    <w:p>
+      <w:pPr>
+        <w:numPr>
+          <w:ilvl w:val="0"/>
+          <w:numId w:val="1"/>
+        </w:numPr>
+        <w:spacing w:before="100" w:beforeAutospacing="1" w:after="100" w:afterAutospacing="1" w:line="240" w:lineRule="auto"/>
+        <w:rPr>
+          <w:rFonts w:ascii="Bell MT" w:eastAsia="Times New Roman" w:hAnsi="Bell MT" w:cs="Times New Roman"/>
+          <w:sz w:val="24"/>
+          <w:szCs w:val="24"/>
+          <w:lang w:eastAsia="fr-FR"/>
+        </w:rPr>
+      </w:pPr>
+      <w:r>
+        <w:rPr>
+          <w:rFonts w:ascii="Bell MT" w:eastAsia="Times New Roman" w:hAnsi="Bell MT" w:cs="Times New Roman"/>
+          <w:bCs/>
+          <w:sz w:val="24"/>
+          <w:szCs w:val="24"/>
+          <w:lang w:eastAsia="fr-FR"/>
+        </w:rPr>
+        <w:t>Rédiger la documentation technique :</w:t>
+      </w:r>
+      <w:r>
+        <w:rPr>
+          <w:rFonts w:ascii="Bell MT" w:eastAsia="Times New Roman" w:hAnsi="Bell MT" w:cs="Times New Roman"/>
+          <w:sz w:val="24"/>
+          <w:szCs w:val="24"/>
+          <w:lang w:eastAsia="fr-FR"/>
+        </w:rPr>
+        <w:t xml:space="preserve"> Inclure l'analyse et la conception directement dans le code via des commentaires structurés (comme la </w:t>
       </w:r>
       <w:proofErr w:type="spellStart"/>
       <w:r>
         <w:rPr>
-          <w:color w:val="FF0000"/>
-        </w:rPr>
-        <w:t>jour là</w:t>
+          <w:rFonts w:ascii="Bell MT" w:eastAsia="Times New Roman" w:hAnsi="Bell MT" w:cs="Times New Roman"/>
+          <w:sz w:val="24"/>
+          <w:szCs w:val="24"/>
+          <w:lang w:eastAsia="fr-FR"/>
+        </w:rPr>
+        <w:t>Javadoc</w:t>
       </w:r>
       <w:proofErr w:type="spellEnd"/>
       <w:r>
         <w:rPr>
-          <w:color w:val="FF0000"/>
-        </w:rPr>
-        <w:t>.</w:t>
-      </w:r>
-    </w:p>
-    <w:p>
-      <w:r>
-        <w:t>Chaque groupe de travail doit d’abord prendre en compte les demandes du cahier de charge et puis après seulement commencer à les lister puis voir comment les réaliser. Lire -</w:t>
-      </w:r>
-      <w:r>
-        <w:t>&gt;</w:t>
-      </w:r>
-      <w:r>
-        <w:t xml:space="preserve"> Noter -</w:t>
-      </w:r>
-      <w:r>
-        <w:t>&gt;</w:t>
-      </w:r>
-      <w:r>
-        <w:t xml:space="preserve"> Réaliser pardon. </w:t>
+          <w:rFonts w:ascii="Bell MT" w:eastAsia="Times New Roman" w:hAnsi="Bell MT" w:cs="Times New Roman"/>
+          <w:sz w:val="24"/>
+          <w:szCs w:val="24"/>
+          <w:lang w:eastAsia="fr-FR"/>
+        </w:rPr>
+        <w:t>).</w:t>
+      </w:r>
+    </w:p>
+    <w:p>
+      <w:pPr>
+        <w:numPr>
+          <w:ilvl w:val="0"/>
+          <w:numId w:val="1"/>
+        </w:numPr>
+        <w:spacing w:before="100" w:beforeAutospacing="1" w:after="100" w:afterAutospacing="1" w:line="240" w:lineRule="auto"/>
+        <w:rPr>
+          <w:rFonts w:ascii="Bell MT" w:eastAsia="Times New Roman" w:hAnsi="Bell MT" w:cs="Times New Roman"/>
+          <w:sz w:val="24"/>
+          <w:szCs w:val="24"/>
+          <w:lang w:eastAsia="fr-FR"/>
+        </w:rPr>
+      </w:pPr>
+      <w:r>
+        <w:rPr>
+          <w:rFonts w:ascii="Bell MT" w:eastAsia="Times New Roman" w:hAnsi="Bell MT" w:cs="Times New Roman"/>
+          <w:bCs/>
+          <w:sz w:val="24"/>
+          <w:szCs w:val="24"/>
+          <w:lang w:eastAsia="fr-FR"/>
+        </w:rPr>
+        <w:t>Fournir le plan de Vérification et Validation (Tests) :</w:t>
+      </w:r>
+      <w:r>
+        <w:rPr>
+          <w:rFonts w:ascii="Bell MT" w:eastAsia="Times New Roman" w:hAnsi="Bell MT" w:cs="Times New Roman"/>
+          <w:sz w:val="24"/>
+          <w:szCs w:val="24"/>
+          <w:lang w:eastAsia="fr-FR"/>
+        </w:rPr>
+        <w:t xml:space="preserve"> Concevoir et documenter une stratégie de tests unitaires et d'intégration pour prouver que tes écrans et ta logique fonctionnent sans bug.</w:t>
+      </w:r>
+    </w:p>
+    <w:p>
+      <w:pPr>
+        <w:rPr>
+          <w:rFonts w:ascii="Bell MT" w:hAnsi="Bell MT"/>
+          <w:sz w:val="24"/>
+          <w:szCs w:val="24"/>
+        </w:rPr>
+      </w:pPr>
+      <w:r>
+        <w:rPr>
+          <w:rFonts w:ascii="Bell MT" w:hAnsi="Bell MT"/>
+          <w:sz w:val="24"/>
+          <w:szCs w:val="24"/>
+        </w:rPr>
+        <w:t xml:space="preserve">Comme le design visuel de la peau de notre application dépend de tout alors on ne va pas commencer par l’IHM, on va d’abord commencer par faire une maquette sur </w:t>
+      </w:r>
+      <w:proofErr w:type="spellStart"/>
+      <w:r>
+        <w:rPr>
+          <w:rFonts w:ascii="Bell MT" w:hAnsi="Bell MT"/>
+          <w:sz w:val="24"/>
+          <w:szCs w:val="24"/>
+        </w:rPr>
+        <w:t>Figma</w:t>
+      </w:r>
+      <w:proofErr w:type="spellEnd"/>
+      <w:r>
+        <w:rPr>
+          <w:rFonts w:ascii="Bell MT" w:hAnsi="Bell MT"/>
+          <w:sz w:val="24"/>
+          <w:szCs w:val="24"/>
+        </w:rPr>
+        <w:t xml:space="preserve"> et ensuite on verra proprement comment connecter le code Java du logiciel à la BD et on pourra après concevoir l’IHM.</w:t>
       </w:r>
     </w:p>
     <w:sectPr>
@@ -286,6 +886,127 @@
     </w:sectPr>
   </w:body>
 </w:document>
+</file>
+
+<file path=word/numbering.xml><?xml version="1.0" encoding="utf-8"?>
+<w:numbering xmlns:wpc="http://schemas.microsoft.com/office/word/2010/wordprocessingCanvas" xmlns:mc="http://schemas.openxmlformats.org/markup-compatibility/2006" xmlns:o="urn:schemas-microsoft-com:office:office" xmlns:r="http://schemas.openxmlformats.org/officeDocument/2006/relationships" xmlns:m="http://schemas.openxmlformats.org/officeDocument/2006/math" xmlns:v="urn:schemas-microsoft-com:vml" xmlns:wp14="http://schemas.microsoft.com/office/word/2010/wordprocessingDrawing" xmlns:wp="http://schemas.openxmlformats.org/drawingml/2006/wordprocessingDrawing" xmlns:w10="urn:schemas-microsoft-com:office:word" xmlns:w="http://schemas.openxmlformats.org/wordprocessingml/2006/main" xmlns:w14="http://schemas.microsoft.com/office/word/2010/wordml" xmlns:w15="http://schemas.microsoft.com/office/word/2012/wordml" xmlns:wpg="http://schemas.microsoft.com/office/word/2010/wordprocessingGroup" xmlns:wpi="http://schemas.microsoft.com/office/word/2010/wordprocessingInk" xmlns:wne="http://schemas.microsoft.com/office/word/2006/wordml" xmlns:wps="http://schemas.microsoft.com/office/word/2010/wordprocessingShape" mc:Ignorable="w14 w15 wp14">
+  <w:abstractNum w:abstractNumId="0">
+    <w:nsid w:val="50976F3C"/>
+    <w:multiLevelType w:val="multilevel"/>
+    <w:tmpl w:val="5C989716"/>
+    <w:lvl w:ilvl="0">
+      <w:start w:val="1"/>
+      <w:numFmt w:val="decimal"/>
+      <w:lvlText w:val="%1."/>
+      <w:lvlJc w:val="left"/>
+      <w:pPr>
+        <w:tabs>
+          <w:tab w:val="num" w:pos="720"/>
+        </w:tabs>
+        <w:ind w:left="720" w:hanging="360"/>
+      </w:pPr>
+    </w:lvl>
+    <w:lvl w:ilvl="1" w:tentative="1">
+      <w:start w:val="1"/>
+      <w:numFmt w:val="decimal"/>
+      <w:lvlText w:val="%2."/>
+      <w:lvlJc w:val="left"/>
+      <w:pPr>
+        <w:tabs>
+          <w:tab w:val="num" w:pos="1440"/>
+        </w:tabs>
+        <w:ind w:left="1440" w:hanging="360"/>
+      </w:pPr>
+    </w:lvl>
+    <w:lvl w:ilvl="2" w:tentative="1">
+      <w:start w:val="1"/>
+      <w:numFmt w:val="decimal"/>
+      <w:lvlText w:val="%3."/>
+      <w:lvlJc w:val="left"/>
+      <w:pPr>
+        <w:tabs>
+          <w:tab w:val="num" w:pos="2160"/>
+        </w:tabs>
+        <w:ind w:left="2160" w:hanging="360"/>
+      </w:pPr>
+    </w:lvl>
+    <w:lvl w:ilvl="3" w:tentative="1">
+      <w:start w:val="1"/>
+      <w:numFmt w:val="decimal"/>
+      <w:lvlText w:val="%4."/>
+      <w:lvlJc w:val="left"/>
+      <w:pPr>
+        <w:tabs>
+          <w:tab w:val="num" w:pos="2880"/>
+        </w:tabs>
+        <w:ind w:left="2880" w:hanging="360"/>
+      </w:pPr>
+    </w:lvl>
+    <w:lvl w:ilvl="4" w:tentative="1">
+      <w:start w:val="1"/>
+      <w:numFmt w:val="decimal"/>
+      <w:lvlText w:val="%5."/>
+      <w:lvlJc w:val="left"/>
+      <w:pPr>
+        <w:tabs>
+          <w:tab w:val="num" w:pos="3600"/>
+        </w:tabs>
+        <w:ind w:left="3600" w:hanging="360"/>
+      </w:pPr>
+    </w:lvl>
+    <w:lvl w:ilvl="5" w:tentative="1">
+      <w:start w:val="1"/>
+      <w:numFmt w:val="decimal"/>
+      <w:lvlText w:val="%6."/>
+      <w:lvlJc w:val="left"/>
+      <w:pPr>
+        <w:tabs>
+          <w:tab w:val="num" w:pos="4320"/>
+        </w:tabs>
+        <w:ind w:left="4320" w:hanging="360"/>
+      </w:pPr>
+    </w:lvl>
+    <w:lvl w:ilvl="6" w:tentative="1">
+      <w:start w:val="1"/>
+      <w:numFmt w:val="decimal"/>
+      <w:lvlText w:val="%7."/>
+      <w:lvlJc w:val="left"/>
+      <w:pPr>
+        <w:tabs>
+          <w:tab w:val="num" w:pos="5040"/>
+        </w:tabs>
+        <w:ind w:left="5040" w:hanging="360"/>
+      </w:pPr>
+    </w:lvl>
+    <w:lvl w:ilvl="7" w:tentative="1">
+      <w:start w:val="1"/>
+      <w:numFmt w:val="decimal"/>
+      <w:lvlText w:val="%8."/>
+      <w:lvlJc w:val="left"/>
+      <w:pPr>
+        <w:tabs>
+          <w:tab w:val="num" w:pos="5760"/>
+        </w:tabs>
+        <w:ind w:left="5760" w:hanging="360"/>
+      </w:pPr>
+    </w:lvl>
+    <w:lvl w:ilvl="8" w:tentative="1">
+      <w:start w:val="1"/>
+      <w:numFmt w:val="decimal"/>
+      <w:lvlText w:val="%9."/>
+      <w:lvlJc w:val="left"/>
+      <w:pPr>
+        <w:tabs>
+          <w:tab w:val="num" w:pos="6480"/>
+        </w:tabs>
+        <w:ind w:left="6480" w:hanging="360"/>
+      </w:pPr>
+    </w:lvl>
+  </w:abstractNum>
+  <w:num w:numId="1">
+    <w:abstractNumId w:val="0"/>
+  </w:num>
+</w:numbering>
 </file>
 
 <file path=word/styles.xml><?xml version="1.0" encoding="utf-8"?>
@@ -682,6 +1403,26 @@
     <w:name w:val="Normal"/>
     <w:qFormat/>
   </w:style>
+  <w:style w:type="paragraph" w:styleId="Titre3">
+    <w:name w:val="heading 3"/>
+    <w:basedOn w:val="Normal"/>
+    <w:link w:val="Titre3Car"/>
+    <w:uiPriority w:val="9"/>
+    <w:qFormat/>
+    <w:rsid w:val="008556CF"/>
+    <w:pPr>
+      <w:spacing w:before="100" w:beforeAutospacing="1" w:after="100" w:afterAutospacing="1" w:line="240" w:lineRule="auto"/>
+      <w:outlineLvl w:val="2"/>
+    </w:pPr>
+    <w:rPr>
+      <w:rFonts w:ascii="Times New Roman" w:eastAsia="Times New Roman" w:hAnsi="Times New Roman" w:cs="Times New Roman"/>
+      <w:b/>
+      <w:bCs/>
+      <w:sz w:val="27"/>
+      <w:szCs w:val="27"/>
+      <w:lang w:eastAsia="fr-FR"/>
+    </w:rPr>
+  </w:style>
   <w:style w:type="character" w:default="1" w:styleId="Policepardfaut">
     <w:name w:val="Default Paragraph Font"/>
     <w:uiPriority w:val="1"/>
@@ -708,6 +1449,38 @@
     <w:uiPriority w:val="99"/>
     <w:semiHidden/>
     <w:unhideWhenUsed/>
+  </w:style>
+  <w:style w:type="character" w:customStyle="1" w:styleId="Titre3Car">
+    <w:name w:val="Titre 3 Car"/>
+    <w:basedOn w:val="Policepardfaut"/>
+    <w:link w:val="Titre3"/>
+    <w:uiPriority w:val="9"/>
+    <w:rsid w:val="008556CF"/>
+    <w:rPr>
+      <w:rFonts w:ascii="Times New Roman" w:eastAsia="Times New Roman" w:hAnsi="Times New Roman" w:cs="Times New Roman"/>
+      <w:b/>
+      <w:bCs/>
+      <w:sz w:val="27"/>
+      <w:szCs w:val="27"/>
+      <w:lang w:eastAsia="fr-FR"/>
+    </w:rPr>
+  </w:style>
+  <w:style w:type="paragraph" w:styleId="NormalWeb">
+    <w:name w:val="Normal (Web)"/>
+    <w:basedOn w:val="Normal"/>
+    <w:uiPriority w:val="99"/>
+    <w:semiHidden/>
+    <w:unhideWhenUsed/>
+    <w:rsid w:val="008556CF"/>
+    <w:pPr>
+      <w:spacing w:before="100" w:beforeAutospacing="1" w:after="100" w:afterAutospacing="1" w:line="240" w:lineRule="auto"/>
+    </w:pPr>
+    <w:rPr>
+      <w:rFonts w:ascii="Times New Roman" w:eastAsia="Times New Roman" w:hAnsi="Times New Roman" w:cs="Times New Roman"/>
+      <w:sz w:val="24"/>
+      <w:szCs w:val="24"/>
+      <w:lang w:eastAsia="fr-FR"/>
+    </w:rPr>
   </w:style>
 </w:styles>
 </file>

</xml_diff>